<commit_message>
docs(konzepte): Intern-Fassung - Statushinweis am Anfang entfernen
Auf Wunsch fuer die Praesentation wird der gelbe "Zweck dieses Dokuments"-
Block am Anfang der Datei entfernt, damit das Dokument selbst clean fuer
Pitch und Abgabe ist. Die Information zur Schwesterdatei und zur
fachlichen Grundlage bleibt in docs/konzepte/README.md erhalten und ist
fuer Agents und neue Team-Mitglieder dort auffindbar.

Umlaute sind in dieser Datei bereits korrekt ausgeschrieben (ae/oe/ue
waren nur in der zugehoerigen Abgabe-Fassung verwendet).
</commit_message>
<xml_diff>
--- a/docs/konzepte/MS5_Testkonzept_G15_Intern.docx
+++ b/docs/konzepte/MS5_Testkonzept_G15_Intern.docx
@@ -46,147 +46,6 @@
           <w:szCs w:val="22"/>
         </w:rPr>
         <w:t xml:space="preserve">SoPra SoSe 2026 — Gruppe 15 — Adventure Bike ERP</w:t>
-      </w:r>
-    </w:p>
-    <w:tbl>
-      <w:tblPr>
-        <w:tblW w:type="dxa" w:w="9026"/>
-        <w:tblBorders>
-          <w:top w:val="single" w:color="auto" w:sz="4"/>
-          <w:left w:val="single" w:color="auto" w:sz="4"/>
-          <w:bottom w:val="single" w:color="auto" w:sz="4"/>
-          <w:right w:val="single" w:color="auto" w:sz="4"/>
-          <w:insideH w:val="single" w:color="auto" w:sz="4"/>
-          <w:insideV w:val="single" w:color="auto" w:sz="4"/>
-        </w:tblBorders>
-      </w:tblPr>
-      <w:tblGrid>
-        <w:gridCol w:w="9026"/>
-      </w:tblGrid>
-      <w:tr>
-        <w:tc>
-          <w:tcPr>
-            <w:tcW w:type="dxa" w:w="9026"/>
-            <w:tcBorders>
-              <w:top w:val="single" w:color="BFBFBF" w:sz="4"/>
-              <w:left w:val="single" w:color="BFBFBF" w:sz="4"/>
-              <w:bottom w:val="single" w:color="BFBFBF" w:sz="4"/>
-              <w:right w:val="single" w:color="BFBFBF" w:sz="4"/>
-            </w:tcBorders>
-            <w:shd w:fill="FFF2CC" w:val="clear"/>
-            <w:tcMar>
-              <w:top w:type="dxa" w:w="160"/>
-              <w:left w:type="dxa" w:w="200"/>
-              <w:bottom w:type="dxa" w:w="160"/>
-              <w:right w:type="dxa" w:w="200"/>
-            </w:tcMar>
-          </w:tcPr>
-          <w:p>
-            <w:pPr>
-              <w:spacing w:after="80" w:before="0"/>
-            </w:pPr>
-            <w:r>
-              <w:rPr>
-                <w:rFonts w:ascii="Calibri" w:cs="Calibri" w:eastAsia="Calibri" w:hAnsi="Calibri"/>
-                <w:b/>
-                <w:bCs/>
-                <w:sz w:val="22"/>
-                <w:szCs w:val="22"/>
-              </w:rPr>
-              <w:t xml:space="preserve">Zweck dieses Dokuments</w:t>
-            </w:r>
-          </w:p>
-          <w:p>
-            <w:pPr>
-              <w:spacing w:after="60" w:before="0"/>
-            </w:pPr>
-            <w:r>
-              <w:rPr>
-                <w:rFonts w:ascii="Calibri" w:cs="Calibri" w:eastAsia="Calibri" w:hAnsi="Calibri"/>
-                <w:sz w:val="22"/>
-                <w:szCs w:val="22"/>
-              </w:rPr>
-              <w:t xml:space="preserve">Dies ist die ausführliche, technische Fassung des MS5-Test- und Abnahmekonzepts. Zielgruppe: internes Projekt-Team, Reviewer (auch KI-Agents wie Codex), Architekt. Sie enthält konkrete Objektnamen, Test-IDs, SPC-Tabelle und Risiken.</w:t>
-            </w:r>
-          </w:p>
-          <w:p>
-            <w:pPr>
-              <w:spacing w:after="60" w:before="60"/>
-            </w:pPr>
-            <w:r>
-              <w:rPr>
-                <w:rFonts w:ascii="Calibri" w:cs="Calibri" w:eastAsia="Calibri" w:hAnsi="Calibri"/>
-                <w:b/>
-                <w:bCs/>
-                <w:sz w:val="22"/>
-                <w:szCs w:val="22"/>
-              </w:rPr>
-              <w:t xml:space="preserve">Schwesterdatei: </w:t>
-            </w:r>
-            <w:r>
-              <w:rPr>
-                <w:rFonts w:ascii="Calibri" w:cs="Calibri" w:eastAsia="Calibri" w:hAnsi="Calibri"/>
-                <w:sz w:val="22"/>
-                <w:szCs w:val="22"/>
-              </w:rPr>
-              <w:t xml:space="preserve">MS5_Testkonzept_G15_Abgabe.docx </w:t>
-            </w:r>
-            <w:r>
-              <w:rPr>
-                <w:rFonts w:ascii="Calibri" w:cs="Calibri" w:eastAsia="Calibri" w:hAnsi="Calibri"/>
-                <w:sz w:val="22"/>
-                <w:szCs w:val="22"/>
-              </w:rPr>
-              <w:t xml:space="preserve">ist die kompakte Abgabe-/Präsentationsfassung im Stil der Prof-Vorlage. Inhaltlich gleicher Stand, aber bewusst weniger technisch.</w:t>
-            </w:r>
-          </w:p>
-          <w:p>
-            <w:pPr>
-              <w:spacing w:after="0" w:before="60"/>
-            </w:pPr>
-            <w:r>
-              <w:rPr>
-                <w:rFonts w:ascii="Calibri" w:cs="Calibri" w:eastAsia="Calibri" w:hAnsi="Calibri"/>
-                <w:b/>
-                <w:bCs/>
-                <w:sz w:val="22"/>
-                <w:szCs w:val="22"/>
-              </w:rPr>
-              <w:t xml:space="preserve">Fachliche Grundlage: </w:t>
-            </w:r>
-            <w:r>
-              <w:rPr>
-                <w:rFonts w:ascii="Calibri" w:cs="Calibri" w:eastAsia="Calibri" w:hAnsi="Calibri"/>
-                <w:sz w:val="22"/>
-                <w:szCs w:val="22"/>
-              </w:rPr>
-              <w:t xml:space="preserve">docs/zielbild.md und docs/schnittstellen_annahmen.md (PR #21 / Codex-Branch </w:t>
-            </w:r>
-            <w:r>
-              <w:rPr>
-                <w:rFonts w:ascii="Calibri" w:cs="Calibri" w:eastAsia="Calibri" w:hAnsi="Calibri"/>
-                <w:i/>
-                <w:iCs/>
-                <w:sz w:val="22"/>
-                <w:szCs w:val="22"/>
-              </w:rPr>
-              <w:t xml:space="preserve">vat-concept-integration-review</w:t>
-            </w:r>
-            <w:r>
-              <w:rPr>
-                <w:rFonts w:ascii="Calibri" w:cs="Calibri" w:eastAsia="Calibri" w:hAnsi="Calibri"/>
-                <w:sz w:val="22"/>
-                <w:szCs w:val="22"/>
-              </w:rPr>
-              <w:t xml:space="preserve">) sowie Übergabe-Doku Systemkonzept V2 vom 2026-06-08.</w:t>
-            </w:r>
-          </w:p>
-        </w:tc>
-      </w:tr>
-    </w:tbl>
-    <w:p>
-      <w:r>
-        <w:t xml:space="preserve"/>
       </w:r>
     </w:p>
     <w:tbl>

</xml_diff>